<commit_message>
download final gdoc docx
</commit_message>
<xml_diff>
--- a/bfaber-writeup.docx
+++ b/bfaber-writeup.docx
@@ -1754,12 +1754,12 @@
           <wp:inline distB="114300" distT="114300" distL="114300" distR="114300">
             <wp:extent cx="5943600" cy="3543300"/>
             <wp:effectExtent b="0" l="0" r="0" t="0"/>
-            <wp:docPr id="1" name="image2.png"/>
+            <wp:docPr id="1" name="image1.png"/>
             <a:graphic>
               <a:graphicData uri="http://schemas.openxmlformats.org/drawingml/2006/picture">
                 <pic:pic>
                   <pic:nvPicPr>
-                    <pic:cNvPr id="0" name="image2.png"/>
+                    <pic:cNvPr id="0" name="image1.png"/>
                     <pic:cNvPicPr preferRelativeResize="0"/>
                   </pic:nvPicPr>
                   <pic:blipFill>
@@ -9402,6 +9402,31 @@
     </w:p>
     <w:p>
       <w:pPr>
+        <w:keepNext w:val="0"/>
+        <w:keepLines w:val="0"/>
+        <w:pageBreakBefore w:val="0"/>
+        <w:widowControl w:val="1"/>
+        <w:pBdr>
+          <w:top w:space="0" w:sz="0" w:val="nil"/>
+          <w:left w:space="0" w:sz="0" w:val="nil"/>
+          <w:bottom w:space="0" w:sz="0" w:val="nil"/>
+          <w:right w:space="0" w:sz="0" w:val="nil"/>
+          <w:between w:space="0" w:sz="0" w:val="nil"/>
+        </w:pBdr>
+        <w:shd w:fill="auto" w:val="clear"/>
+        <w:spacing w:after="180" w:before="180" w:line="240" w:lineRule="auto"/>
+        <w:ind w:left="0" w:right="0" w:firstLine="0"/>
+        <w:jc w:val="left"/>
+        <w:rPr/>
+      </w:pPr>
+      <w:r>
+        <w:rPr>
+          <w:rtl w:val="0"/>
+        </w:rPr>
+      </w:r>
+    </w:p>
+    <w:p>
+      <w:pPr>
         <w:pStyle w:val="Heading3"/>
         <w:rPr/>
       </w:pPr>
@@ -9963,6 +9988,40 @@
         </w:rPr>
         <w:t xml:space="preserve"> log-rank units).</w:t>
       </w:r>
+    </w:p>
+    <w:p>
+      <w:pPr>
+        <w:keepNext w:val="0"/>
+        <w:keepLines w:val="0"/>
+        <w:pageBreakBefore w:val="0"/>
+        <w:widowControl w:val="1"/>
+        <w:pBdr>
+          <w:top w:space="0" w:sz="0" w:val="nil"/>
+          <w:left w:space="0" w:sz="0" w:val="nil"/>
+          <w:bottom w:space="0" w:sz="0" w:val="nil"/>
+          <w:right w:space="0" w:sz="0" w:val="nil"/>
+          <w:between w:space="0" w:sz="0" w:val="nil"/>
+        </w:pBdr>
+        <w:shd w:fill="auto" w:val="clear"/>
+        <w:spacing w:after="180" w:before="180" w:line="240" w:lineRule="auto"/>
+        <w:ind w:left="0" w:right="0" w:firstLine="0"/>
+        <w:jc w:val="left"/>
+        <w:rPr>
+          <w:rFonts w:ascii="Aptos" w:cs="Aptos" w:eastAsia="Aptos" w:hAnsi="Aptos"/>
+          <w:b w:val="0"/>
+          <w:bCs w:val="0"/>
+          <w:i w:val="0"/>
+          <w:iCs w:val="0"/>
+          <w:smallCaps w:val="0"/>
+          <w:strike w:val="0"/>
+          <w:color w:val="000000"/>
+          <w:sz w:val="24"/>
+          <w:szCs w:val="24"/>
+          <w:u w:val="none"/>
+          <w:shd w:fill="auto" w:val="clear"/>
+          <w:vertAlign w:val="baseline"/>
+        </w:rPr>
+      </w:pPr>
       <w:r>
         <w:rPr>
           <w:rFonts w:ascii="Aptos" w:cs="Aptos" w:eastAsia="Aptos" w:hAnsi="Aptos"/>
@@ -9983,12 +10042,12 @@
           <wp:inline distB="114300" distT="114300" distL="114300" distR="114300">
             <wp:extent cx="5943600" cy="3517900"/>
             <wp:effectExtent b="0" l="0" r="0" t="0"/>
-            <wp:docPr id="2" name="image3.png"/>
+            <wp:docPr id="2" name="image2.png"/>
             <a:graphic>
               <a:graphicData uri="http://schemas.openxmlformats.org/drawingml/2006/picture">
                 <pic:pic>
                   <pic:nvPicPr>
-                    <pic:cNvPr id="0" name="image3.png"/>
+                    <pic:cNvPr id="0" name="image2.png"/>
                     <pic:cNvPicPr preferRelativeResize="0"/>
                   </pic:nvPicPr>
                   <pic:blipFill>
@@ -10068,7 +10127,7 @@
           <w:vertAlign w:val="baseline"/>
           <w:rtl w:val="0"/>
         </w:rPr>
-        <w:t xml:space="preserve">Figure:</w:t>
+        <w:t xml:space="preserve">Figure 3:</w:t>
       </w:r>
       <w:r>
         <w:rPr>
@@ -11929,7 +11988,7 @@
             <w:u w:val="single"/>
             <w:rtl w:val="0"/>
           </w:rPr>
-          <w:t xml:space="preserve">(Full experiment notebook.)</w:t>
+          <w:t xml:space="preserve">(Full experiment notebook; see “Control acquisition reproduction check” near the end.)</w:t>
         </w:r>
       </w:hyperlink>
       <w:r>
@@ -13238,7 +13297,7 @@
         <w:rPr>
           <w:rtl w:val="0"/>
         </w:rPr>
-        <w:t xml:space="preserve">6. Maybe It’s Lexical?</w:t>
+        <w:t xml:space="preserve">6. Maybe it's Lexical?</w:t>
       </w:r>
     </w:p>
     <w:p>
@@ -15193,12 +15252,12 @@
           <wp:inline distB="114300" distT="114300" distL="114300" distR="114300">
             <wp:extent cx="5943600" cy="3937000"/>
             <wp:effectExtent b="0" l="0" r="0" t="0"/>
-            <wp:docPr id="3" name="image1.png"/>
+            <wp:docPr id="3" name="image3.png"/>
             <a:graphic>
               <a:graphicData uri="http://schemas.openxmlformats.org/drawingml/2006/picture">
                 <pic:pic>
                   <pic:nvPicPr>
-                    <pic:cNvPr id="0" name="image1.png"/>
+                    <pic:cNvPr id="0" name="image3.png"/>
                     <pic:cNvPicPr preferRelativeResize="0"/>
                   </pic:nvPicPr>
                   <pic:blipFill>
@@ -15278,7 +15337,7 @@
           <w:vertAlign w:val="baseline"/>
           <w:rtl w:val="0"/>
         </w:rPr>
-        <w:t xml:space="preserve">Figure:</w:t>
+        <w:t xml:space="preserve">Figure 4:</w:t>
       </w:r>
       <w:r>
         <w:rPr>
@@ -16270,19 +16329,6 @@
         </w:pict>
       </w:r>
       <w:r>
-        <w:br w:type="page"/>
-      </w:r>
-      <w:r>
-        <w:rPr>
-          <w:rtl w:val="0"/>
-        </w:rPr>
-      </w:r>
-    </w:p>
-    <w:p>
-      <w:pPr>
-        <w:rPr/>
-      </w:pPr>
-      <w:r>
         <w:rPr>
           <w:rtl w:val="0"/>
         </w:rPr>
@@ -17159,6 +17205,17 @@
         <w:rPr>
           <w:rtl w:val="0"/>
         </w:rPr>
+      </w:r>
+    </w:p>
+    <w:p>
+      <w:pPr>
+        <w:pStyle w:val="Heading3"/>
+        <w:rPr/>
+      </w:pPr>
+      <w:r>
+        <w:rPr>
+          <w:rtl w:val="0"/>
+        </w:rPr>
         <w:t xml:space="preserve">Final word</w:t>
       </w:r>
     </w:p>
@@ -17266,6 +17323,72 @@
           <w:rtl w:val="0"/>
         </w:rPr>
         <w:t xml:space="preserve">Something.</w:t>
+      </w:r>
+    </w:p>
+    <w:p>
+      <w:pPr>
+        <w:keepNext w:val="0"/>
+        <w:keepLines w:val="0"/>
+        <w:pageBreakBefore w:val="0"/>
+        <w:widowControl w:val="1"/>
+        <w:pBdr>
+          <w:top w:space="0" w:sz="0" w:val="nil"/>
+          <w:left w:space="0" w:sz="0" w:val="nil"/>
+          <w:bottom w:space="0" w:sz="0" w:val="nil"/>
+          <w:right w:space="0" w:sz="0" w:val="nil"/>
+          <w:between w:space="0" w:sz="0" w:val="nil"/>
+        </w:pBdr>
+        <w:shd w:fill="auto" w:val="clear"/>
+        <w:spacing w:after="180" w:before="180" w:line="240" w:lineRule="auto"/>
+        <w:ind w:left="0" w:right="0" w:firstLine="0"/>
+        <w:jc w:val="left"/>
+        <w:rPr/>
+      </w:pPr>
+      <w:r>
+        <w:rPr>
+          <w:rtl w:val="0"/>
+        </w:rPr>
+      </w:r>
+    </w:p>
+    <w:p>
+      <w:pPr>
+        <w:keepNext w:val="0"/>
+        <w:keepLines w:val="0"/>
+        <w:pageBreakBefore w:val="0"/>
+        <w:widowControl w:val="1"/>
+        <w:pBdr>
+          <w:top w:space="0" w:sz="0" w:val="nil"/>
+          <w:left w:space="0" w:sz="0" w:val="nil"/>
+          <w:bottom w:space="0" w:sz="0" w:val="nil"/>
+          <w:right w:space="0" w:sz="0" w:val="nil"/>
+          <w:between w:space="0" w:sz="0" w:val="nil"/>
+        </w:pBdr>
+        <w:shd w:fill="auto" w:val="clear"/>
+        <w:spacing w:after="180" w:before="180" w:line="240" w:lineRule="auto"/>
+        <w:ind w:left="0" w:right="0" w:firstLine="0"/>
+        <w:jc w:val="left"/>
+        <w:rPr/>
+      </w:pPr>
+      <w:r>
+        <w:rPr>
+          <w:rtl w:val="0"/>
+        </w:rPr>
+        <w:t xml:space="preserve">Thanks for reading, </w:t>
+      </w:r>
+      <w:hyperlink r:id="rId11">
+        <w:r>
+          <w:rPr>
+            <w:color w:val="1155cc"/>
+            <w:u w:val="single"/>
+            <w:rtl w:val="0"/>
+          </w:rPr>
+          <w:t xml:space="preserve">here’s the repo.</w:t>
+        </w:r>
+      </w:hyperlink>
+      <w:r>
+        <w:rPr>
+          <w:rtl w:val="0"/>
+        </w:rPr>
       </w:r>
     </w:p>
     <w:p>

</xml_diff>